<commit_message>
created research report v0.1, moved proposal working and conflict of interest statements folders into the academic documents folder
</commit_message>
<xml_diff>
--- a/Weekly Logs/Matt/Matt Baker - Week 8 Individual Logbook.docx
+++ b/Weekly Logs/Matt/Matt Baker - Week 8 Individual Logbook.docx
@@ -2968,6 +2968,62 @@
     </w:p>
     <w:p>
       <w:pPr>
+        <w:rPr>
+          <w:vertAlign w:val="superscript"/>
+        </w:rPr>
+      </w:pPr>
+      <w:r>
+        <w:t>Thursday, September 3</w:t>
+      </w:r>
+      <w:r>
+        <w:rPr>
+          <w:vertAlign w:val="superscript"/>
+        </w:rPr>
+        <w:t>rd</w:t>
+      </w:r>
+    </w:p>
+    <w:p>
+      <w:r>
+        <w:t>12:00-12:</w:t>
+      </w:r>
+      <w:r>
+        <w:t>45</w:t>
+      </w:r>
+      <w:r>
+        <w:t xml:space="preserve"> (</w:t>
+      </w:r>
+      <w:r>
+        <w:t>45</w:t>
+      </w:r>
+      <w:r>
+        <w:t xml:space="preserve"> mins)</w:t>
+      </w:r>
+    </w:p>
+    <w:p>
+      <w:r>
+        <w:t xml:space="preserve">I Cleaned up </w:t>
+      </w:r>
+      <w:r>
+        <w:t xml:space="preserve">and reorganized </w:t>
+      </w:r>
+      <w:r>
+        <w:t>the Git repository’s file hierarchy</w:t>
+      </w:r>
+      <w:r>
+        <w:t xml:space="preserve">, I created the first version of the </w:t>
+      </w:r>
+      <w:r>
+        <w:t xml:space="preserve">research </w:t>
+      </w:r>
+      <w:r>
+        <w:t>report (v0.1) which is the main deliverable</w:t>
+      </w:r>
+      <w:r>
+        <w:t>.</w:t>
+      </w:r>
+    </w:p>
+    <w:p>
+      <w:pPr>
         <w:pStyle w:val="Heading2"/>
       </w:pPr>
       <w:r>
@@ -3001,15 +3057,7 @@
     </w:p>
     <w:p>
       <w:r>
-        <w:t xml:space="preserve">Experimenting with feeding different file types into </w:t>
-      </w:r>
-      <w:proofErr w:type="spellStart"/>
-      <w:r>
-        <w:t>Ollama</w:t>
-      </w:r>
-      <w:proofErr w:type="spellEnd"/>
-      <w:r>
-        <w:t xml:space="preserve"> based models, with the intention of simulating the processing of </w:t>
+        <w:t xml:space="preserve">Experimenting with feeding different file types into Ollama based models, with the intention of simulating the processing of </w:t>
       </w:r>
       <w:r>
         <w:t xml:space="preserve">the output produced by </w:t>
@@ -3021,15 +3069,7 @@
         <w:t>oremost</w:t>
       </w:r>
       <w:r>
-        <w:t>. Part of this time was figuring out that E01 files need to be converted to .dd or .raw files before being processed by Foremost. To do this you use “</w:t>
-      </w:r>
-      <w:proofErr w:type="spellStart"/>
-      <w:r>
-        <w:t>libewf</w:t>
-      </w:r>
-      <w:proofErr w:type="spellEnd"/>
-      <w:r>
-        <w:t>”. An E01 image is an Expert Witness Format (EWF).</w:t>
+        <w:t>. Part of this time was figuring out that E01 files need to be converted to .dd or .raw files before being processed by Foremost. To do this you use “libewf”. An E01 image is an Expert Witness Format (EWF).</w:t>
       </w:r>
       <w:r>
         <w:t xml:space="preserve"> I ended up experimenting and conducting deep forensic analysis on a particular image.</w:t>
@@ -3054,14 +3094,11 @@
     </w:p>
     <w:p>
       <w:r>
-        <w:lastRenderedPageBreak/>
         <w:t xml:space="preserve">Installing </w:t>
       </w:r>
-      <w:proofErr w:type="spellStart"/>
       <w:r>
         <w:t>libewf</w:t>
       </w:r>
-      <w:proofErr w:type="spellEnd"/>
     </w:p>
     <w:p>
       <w:r>
@@ -3107,23 +3144,7 @@
     </w:p>
     <w:p>
       <w:r>
-        <w:t xml:space="preserve">Using </w:t>
-      </w:r>
-      <w:proofErr w:type="spellStart"/>
-      <w:r>
-        <w:t>Libewf</w:t>
-      </w:r>
-      <w:proofErr w:type="spellEnd"/>
-      <w:r>
-        <w:t xml:space="preserve"> command (1) to convert the E01 to a raw “</w:t>
-      </w:r>
-      <w:proofErr w:type="spellStart"/>
-      <w:r>
-        <w:t>foremostable</w:t>
-      </w:r>
-      <w:proofErr w:type="spellEnd"/>
-      <w:r>
-        <w:t xml:space="preserve">” file (2). </w:t>
+        <w:t xml:space="preserve">Using Libewf command (1) to convert the E01 to a raw “foremostable” file (2). </w:t>
       </w:r>
       <w:r>
         <w:t>Using foremost to file carve this forensic disk image (3), retrieving the output (4) which includes jpg files that I will have the AI examine (4,5).</w:t>
@@ -3186,34 +3207,13 @@
     </w:p>
     <w:p>
       <w:r>
-        <w:t xml:space="preserve">The AI </w:t>
-      </w:r>
-      <w:proofErr w:type="gramStart"/>
-      <w:r>
-        <w:t>is able to</w:t>
-      </w:r>
-      <w:proofErr w:type="gramEnd"/>
-      <w:r>
-        <w:t xml:space="preserve"> tell the manufacturer/model of computer present in the </w:t>
-      </w:r>
-      <w:proofErr w:type="gramStart"/>
-      <w:r>
-        <w:t>image(</w:t>
-      </w:r>
-      <w:proofErr w:type="gramEnd"/>
-      <w:r>
-        <w:t>4), the potentially forensically relevant data within the image such as time</w:t>
+        <w:t>The AI is able to tell the manufacturer/model of computer present in the image(4), the potentially forensically relevant data within the image such as time</w:t>
       </w:r>
       <w:r>
         <w:t xml:space="preserve">, and </w:t>
       </w:r>
-      <w:proofErr w:type="gramStart"/>
-      <w:r>
-        <w:t>date(</w:t>
-      </w:r>
-      <w:proofErr w:type="gramEnd"/>
-      <w:r>
-        <w:t>2,3), and location (1). In a sea of images, this could potentially signal an incredibly useful tool to quickly summarize, consolidate, and cross reference other case-relevant data.</w:t>
+      <w:r>
+        <w:t>date(2,3), and location (1). In a sea of images, this could potentially signal an incredibly useful tool to quickly summarize, consolidate, and cross reference other case-relevant data.</w:t>
       </w:r>
     </w:p>
     <w:p>
@@ -3319,13 +3319,8 @@
       </w:r>
     </w:p>
     <w:p>
-      <w:proofErr w:type="spellStart"/>
-      <w:r>
-        <w:t>Exiftool</w:t>
-      </w:r>
-      <w:proofErr w:type="spellEnd"/>
-      <w:r>
-        <w:t xml:space="preserve"> reveals different times and dates than presented </w:t>
+      <w:r>
+        <w:t xml:space="preserve">Exiftool reveals different times and dates than presented </w:t>
       </w:r>
     </w:p>
     <w:p>
@@ -3333,6 +3328,7 @@
         <w:rPr>
           <w:noProof/>
         </w:rPr>
+        <w:lastRenderedPageBreak/>
         <w:drawing>
           <wp:inline distT="0" distB="0" distL="0" distR="0" wp14:anchorId="79219170" wp14:editId="3C027301">
             <wp:extent cx="4035818" cy="1193800"/>
@@ -3373,15 +3369,7 @@
     <w:p/>
     <w:p>
       <w:r>
-        <w:t xml:space="preserve">This timestamp for </w:t>
-      </w:r>
-      <w:proofErr w:type="gramStart"/>
-      <w:r>
-        <w:t>an</w:t>
-      </w:r>
-      <w:proofErr w:type="gramEnd"/>
-      <w:r>
-        <w:t xml:space="preserve"> ls-l command in the command line, was not picked up by the AI, but appears to show a more accurate date (23</w:t>
+        <w:t>This timestamp for an ls-l command in the command line, was not picked up by the AI, but appears to show a more accurate date (23</w:t>
       </w:r>
       <w:r>
         <w:rPr>
@@ -3479,29 +3467,13 @@
     </w:p>
     <w:p>
       <w:r>
-        <w:t xml:space="preserve">Added PDFs and attempting to find a way for </w:t>
-      </w:r>
-      <w:proofErr w:type="spellStart"/>
-      <w:r>
-        <w:t>Ollama</w:t>
-      </w:r>
-      <w:proofErr w:type="spellEnd"/>
-      <w:r>
-        <w:t xml:space="preserve"> based models to read them.</w:t>
+        <w:t>Added PDFs and attempting to find a way for Ollama based models to read them.</w:t>
       </w:r>
     </w:p>
     <w:p/>
     <w:p>
       <w:r>
-        <w:t xml:space="preserve">One way is to use </w:t>
-      </w:r>
-      <w:proofErr w:type="spellStart"/>
-      <w:r>
-        <w:t>pdftotext</w:t>
-      </w:r>
-      <w:proofErr w:type="spellEnd"/>
-      <w:r>
-        <w:t xml:space="preserve"> to convert the pdf and then pass in the pdf as a text file</w:t>
+        <w:t>One way is to use pdftotext to convert the pdf and then pass in the pdf as a text file</w:t>
       </w:r>
     </w:p>
     <w:p>
@@ -3551,15 +3523,7 @@
     </w:p>
     <w:p>
       <w:r>
-        <w:t>I tested .</w:t>
-      </w:r>
-      <w:proofErr w:type="spellStart"/>
-      <w:r>
-        <w:t>png</w:t>
-      </w:r>
-      <w:proofErr w:type="spellEnd"/>
-      <w:r>
-        <w:t xml:space="preserve"> file types too</w:t>
+        <w:t>I tested .png file types too</w:t>
       </w:r>
     </w:p>
     <w:p>
@@ -3614,7 +3578,6 @@
       <w:r>
         <w:t>45</w:t>
       </w:r>
-      <w:proofErr w:type="gramStart"/>
       <w:r>
         <w:t>PM</w:t>
       </w:r>
@@ -3622,11 +3585,7 @@
         <w:t xml:space="preserve"> </w:t>
       </w:r>
       <w:r>
-        <w:t xml:space="preserve"> +</w:t>
-      </w:r>
-      <w:proofErr w:type="gramEnd"/>
-      <w:r>
-        <w:t xml:space="preserve"> 4:45-5PM (1hr 45 mins)</w:t>
+        <w:t xml:space="preserve"> + 4:45-5PM (1hr 45 mins)</w:t>
       </w:r>
     </w:p>
     <w:p>
@@ -3640,15 +3599,11 @@
         <w:t xml:space="preserve"> a “Snellen chart” for AI to objectively compare how much detail different models can extract from images containing evidence.</w:t>
       </w:r>
       <w:r>
-        <w:t xml:space="preserve"> I created it with commonly mistaken words, however, there are many more variables that determine the legibility of a text. </w:t>
-      </w:r>
-      <w:proofErr w:type="gramStart"/>
-      <w:r>
-        <w:t>So</w:t>
-      </w:r>
-      <w:proofErr w:type="gramEnd"/>
-      <w:r>
-        <w:t xml:space="preserve"> this test is testing for size.</w:t>
+        <w:t xml:space="preserve"> I created it with commonly mistaken words, however, there are </w:t>
+      </w:r>
+      <w:r>
+        <w:lastRenderedPageBreak/>
+        <w:t>many more variables that determine the legibility of a text. So this test is testing for size.</w:t>
       </w:r>
       <w:r>
         <w:t xml:space="preserve"> The chart is in a 1080 x 1920 format.</w:t>
@@ -3659,7 +3614,6 @@
         <w:rPr>
           <w:noProof/>
         </w:rPr>
-        <w:lastRenderedPageBreak/>
         <w:drawing>
           <wp:inline distT="0" distB="0" distL="0" distR="0" wp14:anchorId="7CF84914" wp14:editId="04CC6EE7">
             <wp:extent cx="5729605" cy="3946525"/>
@@ -3959,15 +3913,7 @@
         <w:t xml:space="preserve">esting </w:t>
       </w:r>
       <w:r>
-        <w:t>“</w:t>
-      </w:r>
-      <w:proofErr w:type="spellStart"/>
-      <w:r>
-        <w:t>Deepseek</w:t>
-      </w:r>
-      <w:proofErr w:type="spellEnd"/>
-      <w:r>
-        <w:t xml:space="preserve"> harness”, </w:t>
+        <w:t xml:space="preserve">“Deepseek harness”, </w:t>
       </w:r>
       <w:r>
         <w:t xml:space="preserve">assessing </w:t>
@@ -3984,14 +3930,12 @@
       <w:r>
         <w:t xml:space="preserve"> </w:t>
       </w:r>
-      <w:proofErr w:type="spellStart"/>
       <w:r>
         <w:t>O</w:t>
       </w:r>
       <w:r>
         <w:t>llama</w:t>
       </w:r>
-      <w:proofErr w:type="spellEnd"/>
       <w:r>
         <w:t>.</w:t>
       </w:r>
@@ -4008,20 +3952,18 @@
         <w:lastRenderedPageBreak/>
         <w:t xml:space="preserve">Installed </w:t>
       </w:r>
-      <w:proofErr w:type="spellStart"/>
       <w:r>
         <w:t>D</w:t>
       </w:r>
       <w:r>
-        <w:t>eepseek</w:t>
-      </w:r>
-      <w:proofErr w:type="spellEnd"/>
-      <w:r>
-        <w:t xml:space="preserve"> harness, it runs locally on a browser, and lets you set your workspace, this could allow us to constrain a model’s purview while allowing it to complete its work automatically within a dedicated full-access working environment.</w:t>
-      </w:r>
-    </w:p>
-    <w:p>
-      <w:r>
+        <w:t>eepseek harness, it runs locally on a browser, and lets you set your workspace, this could allow us to constrain a model’s purview while allowing it to complete its work automatically within a dedicated full-access working environment.</w:t>
+      </w:r>
+    </w:p>
+    <w:p>
+      <w:r>
+        <w:rPr>
+          <w:noProof/>
+        </w:rPr>
         <w:drawing>
           <wp:inline distT="0" distB="0" distL="0" distR="0" wp14:anchorId="631BE3BD" wp14:editId="159C7B8D">
             <wp:extent cx="5729605" cy="4665345"/>
@@ -4061,51 +4003,17 @@
     </w:p>
     <w:p>
       <w:r>
-        <w:t xml:space="preserve">Tested adding multiple image files in </w:t>
-      </w:r>
-      <w:proofErr w:type="spellStart"/>
-      <w:r>
-        <w:t>ollama</w:t>
-      </w:r>
-      <w:proofErr w:type="spellEnd"/>
-      <w:r>
-        <w:t xml:space="preserve">, including a </w:t>
-      </w:r>
-      <w:proofErr w:type="spellStart"/>
-      <w:r>
-        <w:t>webp</w:t>
-      </w:r>
-      <w:proofErr w:type="spellEnd"/>
-      <w:r>
-        <w:t xml:space="preserve"> format, it </w:t>
-      </w:r>
-      <w:proofErr w:type="gramStart"/>
-      <w:r>
-        <w:t>is able to</w:t>
-      </w:r>
-      <w:proofErr w:type="gramEnd"/>
-      <w:r>
-        <w:t xml:space="preserve"> adequately identify these. And correct me later when I asset that is the Australian flag. These tests serve to test the ability of AI to inspect Foremost artefacts</w:t>
-      </w:r>
-      <w:r>
-        <w:t xml:space="preserve">. The model did not </w:t>
-      </w:r>
-      <w:proofErr w:type="gramStart"/>
-      <w:r>
-        <w:t>accept .</w:t>
-      </w:r>
-      <w:proofErr w:type="spellStart"/>
-      <w:r>
-        <w:t>avif</w:t>
-      </w:r>
-      <w:proofErr w:type="spellEnd"/>
-      <w:proofErr w:type="gramEnd"/>
-      <w:r>
-        <w:t xml:space="preserve"> images, although those can be converted.</w:t>
-      </w:r>
-    </w:p>
-    <w:p>
-      <w:r>
+        <w:t>Tested adding multiple image files in ollama, including a webp format, it is able to adequately identify these. And correct me later when I asset that is the Australian flag. These tests serve to test the ability of AI to inspect Foremost artefacts</w:t>
+      </w:r>
+      <w:r>
+        <w:t>. The model did not accept .avif images, although those can be converted.</w:t>
+      </w:r>
+    </w:p>
+    <w:p>
+      <w:r>
+        <w:rPr>
+          <w:noProof/>
+        </w:rPr>
         <w:drawing>
           <wp:inline distT="0" distB="0" distL="0" distR="0" wp14:anchorId="6A47C5B7" wp14:editId="715DB6E7">
             <wp:extent cx="5729605" cy="2453005"/>
@@ -4146,54 +4054,20 @@
     <w:p>
       <w:r>
         <w:lastRenderedPageBreak/>
-        <w:t xml:space="preserve">I tried converting </w:t>
-      </w:r>
-      <w:proofErr w:type="spellStart"/>
-      <w:r>
-        <w:t>avif</w:t>
-      </w:r>
-      <w:proofErr w:type="spellEnd"/>
-      <w:r>
-        <w:t xml:space="preserve"> to </w:t>
-      </w:r>
-      <w:proofErr w:type="spellStart"/>
-      <w:r>
-        <w:t>png</w:t>
-      </w:r>
-      <w:proofErr w:type="spellEnd"/>
-      <w:r>
-        <w:t xml:space="preserve"> by changing extension like in windows, that didn’t work, so I installed and used </w:t>
-      </w:r>
-      <w:proofErr w:type="spellStart"/>
-      <w:r>
-        <w:t>avif</w:t>
-      </w:r>
-      <w:proofErr w:type="spellEnd"/>
-      <w:r>
-        <w:t xml:space="preserve"> to convert a real photo of the Korean war into a </w:t>
-      </w:r>
-      <w:proofErr w:type="spellStart"/>
-      <w:r>
-        <w:t>png</w:t>
-      </w:r>
-      <w:proofErr w:type="spellEnd"/>
-      <w:r>
-        <w:t>, the AI previously correctly identified an AI image of the Korean war as fake, and now I wanted to test the alternative. It uses superficial logic to assert this false-positive notion</w:t>
-      </w:r>
-      <w:r>
-        <w:t xml:space="preserve"> that </w:t>
-      </w:r>
-      <w:proofErr w:type="gramStart"/>
-      <w:r>
-        <w:t xml:space="preserve">the </w:t>
+        <w:t>I tried converting avif to png by changing extension like in windows, that didn’t work, so I installed and used avif to convert a real photo of the Korean war into a png, the AI previously correctly identified an AI image of the Korean war as fake, and now I wanted to test the alternative. It uses superficial logic to assert this false-positive notion</w:t>
+      </w:r>
+      <w:r>
+        <w:t xml:space="preserve"> that the</w:t>
       </w:r>
       <w:r>
         <w:t>.</w:t>
       </w:r>
-      <w:proofErr w:type="gramEnd"/>
-    </w:p>
-    <w:p>
-      <w:r>
+    </w:p>
+    <w:p>
+      <w:r>
+        <w:rPr>
+          <w:noProof/>
+        </w:rPr>
         <w:drawing>
           <wp:inline distT="0" distB="0" distL="0" distR="0" wp14:anchorId="50C65FA3" wp14:editId="5AAD3724">
             <wp:extent cx="5729605" cy="2228850"/>

</xml_diff>

<commit_message>
created the file processing guide v0.1, updated week 8 log
</commit_message>
<xml_diff>
--- a/Weekly Logs/Matt/Matt Baker - Week 8 Individual Logbook.docx
+++ b/Weekly Logs/Matt/Matt Baker - Week 8 Individual Logbook.docx
@@ -3007,10 +3007,13 @@
         <w:t xml:space="preserve">and reorganized </w:t>
       </w:r>
       <w:r>
-        <w:t>the Git repository’s file hierarchy</w:t>
-      </w:r>
-      <w:r>
-        <w:t xml:space="preserve">, I created the first version of the </w:t>
+        <w:t xml:space="preserve">the Git repository’s file </w:t>
+      </w:r>
+      <w:r>
+        <w:t>hierarchy;</w:t>
+      </w:r>
+      <w:r>
+        <w:t xml:space="preserve"> I created the first version of the </w:t>
       </w:r>
       <w:r>
         <w:t xml:space="preserve">research </w:t>
@@ -3075,25 +3078,14 @@
         <w:t xml:space="preserve"> I ended up experimenting and conducting deep forensic analysis on a particular image.</w:t>
       </w:r>
     </w:p>
-    <w:p/>
-    <w:p/>
     <w:p>
       <w:pPr>
         <w:ind w:left="0" w:firstLine="0"/>
       </w:pPr>
     </w:p>
     <w:p>
-      <w:pPr>
-        <w:ind w:left="0" w:firstLine="0"/>
-      </w:pPr>
-    </w:p>
-    <w:p>
-      <w:pPr>
-        <w:ind w:left="0" w:firstLine="0"/>
-      </w:pPr>
-    </w:p>
-    <w:p>
-      <w:r>
+      <w:r>
+        <w:lastRenderedPageBreak/>
         <w:t xml:space="preserve">Installing </w:t>
       </w:r>
       <w:r>
@@ -3328,7 +3320,6 @@
         <w:rPr>
           <w:noProof/>
         </w:rPr>
-        <w:lastRenderedPageBreak/>
         <w:drawing>
           <wp:inline distT="0" distB="0" distL="0" distR="0" wp14:anchorId="79219170" wp14:editId="3C027301">
             <wp:extent cx="4035818" cy="1193800"/>
@@ -3599,11 +3590,7 @@
         <w:t xml:space="preserve"> a “Snellen chart” for AI to objectively compare how much detail different models can extract from images containing evidence.</w:t>
       </w:r>
       <w:r>
-        <w:t xml:space="preserve"> I created it with commonly mistaken words, however, there are </w:t>
-      </w:r>
-      <w:r>
-        <w:lastRenderedPageBreak/>
-        <w:t>many more variables that determine the legibility of a text. So this test is testing for size.</w:t>
+        <w:t xml:space="preserve"> I created it with commonly mistaken words, however, there are many more variables that determine the legibility of a text. So this test is testing for size.</w:t>
       </w:r>
       <w:r>
         <w:t xml:space="preserve"> The chart is in a 1080 x 1920 format.</w:t>
@@ -3614,6 +3601,7 @@
         <w:rPr>
           <w:noProof/>
         </w:rPr>
+        <w:lastRenderedPageBreak/>
         <w:drawing>
           <wp:inline distT="0" distB="0" distL="0" distR="0" wp14:anchorId="7CF84914" wp14:editId="04CC6EE7">
             <wp:extent cx="5729605" cy="3946525"/>
@@ -4107,6 +4095,219 @@
     </w:p>
     <w:p>
       <w:pPr>
+        <w:rPr>
+          <w:vertAlign w:val="superscript"/>
+        </w:rPr>
+      </w:pPr>
+      <w:r>
+        <w:t>Thursday, September 3</w:t>
+      </w:r>
+      <w:r>
+        <w:rPr>
+          <w:vertAlign w:val="superscript"/>
+        </w:rPr>
+        <w:t>rd</w:t>
+      </w:r>
+    </w:p>
+    <w:p>
+      <w:r>
+        <w:t>1:30-</w:t>
+      </w:r>
+      <w:r>
+        <w:t>4</w:t>
+      </w:r>
+      <w:r>
+        <w:t>:</w:t>
+      </w:r>
+      <w:r>
+        <w:t>45</w:t>
+      </w:r>
+      <w:r>
+        <w:t>PM</w:t>
+      </w:r>
+      <w:r>
+        <w:t xml:space="preserve"> (3 hours</w:t>
+      </w:r>
+      <w:r>
+        <w:t xml:space="preserve"> 15 mins</w:t>
+      </w:r>
+      <w:r>
+        <w:t>)</w:t>
+      </w:r>
+    </w:p>
+    <w:p>
+      <w:r>
+        <w:t>To standardize testing, and so that we can write a script that handles each file</w:t>
+      </w:r>
+      <w:r>
+        <w:t xml:space="preserve"> in a format that can be fed to Ollama</w:t>
+      </w:r>
+      <w:r>
+        <w:t>, I collect examples of various file types that can be carved with foremost. And place them in a standardized directory.</w:t>
+      </w:r>
+      <w:r>
+        <w:t xml:space="preserve"> I duplicate these files into additional working directories for</w:t>
+      </w:r>
+      <w:r>
+        <w:t xml:space="preserve"> </w:t>
+      </w:r>
+      <w:r>
+        <w:t>testing.</w:t>
+      </w:r>
+      <w:r>
+        <w:t xml:space="preserve"> I also create a guide to processing each file type for whoever is coding the solution</w:t>
+      </w:r>
+      <w:r>
+        <w:t xml:space="preserve"> by </w:t>
+      </w:r>
+      <w:r>
+        <w:t xml:space="preserve">installing and </w:t>
+      </w:r>
+      <w:r>
+        <w:t xml:space="preserve">testing the ability for ffmpeg, pdftotext, </w:t>
+      </w:r>
+      <w:r>
+        <w:t>pandoc</w:t>
+      </w:r>
+      <w:r>
+        <w:t xml:space="preserve"> and ssconvert</w:t>
+      </w:r>
+      <w:r>
+        <w:t xml:space="preserve"> </w:t>
+      </w:r>
+      <w:r>
+        <w:t xml:space="preserve">to adequately </w:t>
+      </w:r>
+      <w:r>
+        <w:t xml:space="preserve">and most efficiently </w:t>
+      </w:r>
+      <w:r>
+        <w:t>convert these forms of data.</w:t>
+      </w:r>
+      <w:r>
+        <w:t xml:space="preserve"> Once I learned about </w:t>
+      </w:r>
+      <w:r>
+        <w:t>piping,</w:t>
+      </w:r>
+      <w:r>
+        <w:t xml:space="preserve"> I was able to </w:t>
+      </w:r>
+      <w:r>
+        <w:t xml:space="preserve">experiment with </w:t>
+      </w:r>
+      <w:r>
+        <w:t>reduc</w:t>
+      </w:r>
+      <w:r>
+        <w:t>ing</w:t>
+      </w:r>
+      <w:r>
+        <w:t xml:space="preserve"> command sizes</w:t>
+      </w:r>
+      <w:r>
+        <w:t xml:space="preserve"> without creating new converted files</w:t>
+      </w:r>
+      <w:r>
+        <w:t>.</w:t>
+      </w:r>
+      <w:r>
+        <w:t xml:space="preserve"> This involved a deal of testing of different CLI tools for converting.</w:t>
+      </w:r>
+    </w:p>
+    <w:p>
+      <w:r>
+        <w:t>All file types, size of respective directories.</w:t>
+      </w:r>
+    </w:p>
+    <w:p>
+      <w:r>
+        <w:drawing>
+          <wp:inline distT="0" distB="0" distL="0" distR="0" wp14:anchorId="0331FCE1" wp14:editId="3B531B50">
+            <wp:extent cx="4751427" cy="3136900"/>
+            <wp:effectExtent l="0" t="0" r="0" b="6350"/>
+            <wp:docPr id="892529544" name="Picture 1"/>
+            <wp:cNvGraphicFramePr>
+              <a:graphicFrameLocks xmlns:a="http://schemas.openxmlformats.org/drawingml/2006/main" noChangeAspect="1"/>
+            </wp:cNvGraphicFramePr>
+            <a:graphic xmlns:a="http://schemas.openxmlformats.org/drawingml/2006/main">
+              <a:graphicData uri="http://schemas.openxmlformats.org/drawingml/2006/picture">
+                <pic:pic xmlns:pic="http://schemas.openxmlformats.org/drawingml/2006/picture">
+                  <pic:nvPicPr>
+                    <pic:cNvPr id="892529544" name=""/>
+                    <pic:cNvPicPr/>
+                  </pic:nvPicPr>
+                  <pic:blipFill>
+                    <a:blip r:embed="rId25"/>
+                    <a:stretch>
+                      <a:fillRect/>
+                    </a:stretch>
+                  </pic:blipFill>
+                  <pic:spPr>
+                    <a:xfrm>
+                      <a:off x="0" y="0"/>
+                      <a:ext cx="4751911" cy="3137220"/>
+                    </a:xfrm>
+                    <a:prstGeom prst="rect">
+                      <a:avLst/>
+                    </a:prstGeom>
+                  </pic:spPr>
+                </pic:pic>
+              </a:graphicData>
+            </a:graphic>
+          </wp:inline>
+        </w:drawing>
+      </w:r>
+    </w:p>
+    <w:p>
+      <w:r>
+        <w:lastRenderedPageBreak/>
+        <w:t>My file processing guide I created</w:t>
+      </w:r>
+    </w:p>
+    <w:p>
+      <w:r>
+        <w:drawing>
+          <wp:inline distT="0" distB="0" distL="0" distR="0" wp14:anchorId="187E26F3" wp14:editId="7D8CD040">
+            <wp:extent cx="5729605" cy="3507105"/>
+            <wp:effectExtent l="0" t="0" r="4445" b="0"/>
+            <wp:docPr id="142888345" name="Picture 1"/>
+            <wp:cNvGraphicFramePr>
+              <a:graphicFrameLocks xmlns:a="http://schemas.openxmlformats.org/drawingml/2006/main" noChangeAspect="1"/>
+            </wp:cNvGraphicFramePr>
+            <a:graphic xmlns:a="http://schemas.openxmlformats.org/drawingml/2006/main">
+              <a:graphicData uri="http://schemas.openxmlformats.org/drawingml/2006/picture">
+                <pic:pic xmlns:pic="http://schemas.openxmlformats.org/drawingml/2006/picture">
+                  <pic:nvPicPr>
+                    <pic:cNvPr id="142888345" name=""/>
+                    <pic:cNvPicPr/>
+                  </pic:nvPicPr>
+                  <pic:blipFill>
+                    <a:blip r:embed="rId26"/>
+                    <a:stretch>
+                      <a:fillRect/>
+                    </a:stretch>
+                  </pic:blipFill>
+                  <pic:spPr>
+                    <a:xfrm>
+                      <a:off x="0" y="0"/>
+                      <a:ext cx="5729605" cy="3507105"/>
+                    </a:xfrm>
+                    <a:prstGeom prst="rect">
+                      <a:avLst/>
+                    </a:prstGeom>
+                  </pic:spPr>
+                </pic:pic>
+              </a:graphicData>
+            </a:graphic>
+          </wp:inline>
+        </w:drawing>
+      </w:r>
+    </w:p>
+    <w:p/>
+    <w:p/>
+    <w:p>
+      <w:pPr>
         <w:pStyle w:val="Heading2"/>
       </w:pPr>
       <w:bookmarkStart w:id="7" w:name="_Toc239087600"/>
@@ -4115,11 +4316,12 @@
       </w:r>
       <w:bookmarkEnd w:id="7"/>
     </w:p>
+    <w:p/>
     <w:sectPr>
-      <w:headerReference w:type="default" r:id="rId25"/>
-      <w:footerReference w:type="even" r:id="rId26"/>
-      <w:footerReference w:type="default" r:id="rId27"/>
-      <w:footerReference w:type="first" r:id="rId28"/>
+      <w:headerReference w:type="default" r:id="rId27"/>
+      <w:footerReference w:type="even" r:id="rId28"/>
+      <w:footerReference w:type="default" r:id="rId29"/>
+      <w:footerReference w:type="first" r:id="rId30"/>
       <w:pgSz w:w="11906" w:h="16838"/>
       <w:pgMar w:top="1483" w:right="1448" w:bottom="1544" w:left="1435" w:header="720" w:footer="730" w:gutter="0"/>
       <w:pgNumType w:start="0"/>

</xml_diff>